<commit_message>
5-6 done, 10 started
</commit_message>
<xml_diff>
--- a/bd/lab2/lab_report.docx
+++ b/bd/lab2/lab_report.docx
@@ -160,26 +160,17 @@
       </w:r>
       <w:r>
         <w:rPr>
-          <w:highlight w:val="yellow"/>
+          <w:shd w:fill="auto" w:val="clear"/>
         </w:rPr>
         <w:t>«</w:t>
       </w:r>
       <w:r>
-        <w:rPr>
-          <w:highlight w:val="yellow"/>
-          <w:u w:val="single"/>
-        </w:rPr>
-        <w:tab/>
-        <w:tab/>
-        <w:tab/>
-        <w:tab/>
-        <w:tab/>
-        <w:tab/>
-        <w:tab/>
-      </w:r>
-      <w:r>
-        <w:rPr>
-          <w:highlight w:val="yellow"/>
+        <w:rPr/>
+        <w:t>Реализация запросов на языке PostgreSQL и анализ результатов запросов.</w:t>
+      </w:r>
+      <w:r>
+        <w:rPr>
+          <w:shd w:fill="auto" w:val="clear"/>
         </w:rPr>
         <w:t>»</w:t>
       </w:r>
@@ -610,12 +601,25 @@
     <w:p>
       <w:pPr>
         <w:pStyle w:val="Normal"/>
-        <w:jc w:val="center"/>
-        <w:rPr/>
-      </w:pPr>
-      <w:r>
-        <w:rPr/>
-        <w:t>/*цель выполнения лабораторной работы*/</w:t>
+        <w:ind w:firstLine="709" w:right="0"/>
+        <w:jc w:val="both"/>
+        <w:rPr/>
+      </w:pPr>
+      <w:r>
+        <w:rPr>
+          <w:lang w:val="ru-RU"/>
+        </w:rPr>
+        <w:t xml:space="preserve">Научиться реализовывать запросы на языке </w:t>
+      </w:r>
+      <w:r>
+        <w:rPr/>
+        <w:t>SQL</w:t>
+      </w:r>
+      <w:r>
+        <w:rPr>
+          <w:lang w:val="ru-RU"/>
+        </w:rPr>
+        <w:t xml:space="preserve"> и анализировать результаты запросов</w:t>
       </w:r>
     </w:p>
     <w:p>
@@ -1510,7 +1514,238 @@
       </w:r>
       <w:r>
         <w:rPr/>
-        <w:t>Чтобы заполнить таблицу данными, нужно нажать на саму таблицу =&gt; ПКМ =&gt; View/Edit Data =&gt; All Rows. Затем, когда заполнение закончено, нужно сохранить изменения нажав f6.</w:t>
+        <w:t xml:space="preserve">Чтобы заполнить таблицу данными, нужно нажать на саму таблицу =&gt; ПКМ =&gt; View/Edit Data =&gt; All Rows. Затем, когда заполнение закончено, нужно сохранить изменения нажав f6. </w:t>
+      </w:r>
+    </w:p>
+    <w:p>
+      <w:pPr>
+        <w:pStyle w:val="Normal"/>
+        <w:jc w:val="left"/>
+        <w:rPr/>
+      </w:pPr>
+      <w:r>
+        <w:rPr/>
+      </w:r>
+    </w:p>
+    <w:p>
+      <w:pPr>
+        <w:pStyle w:val="Normal"/>
+        <w:jc w:val="left"/>
+        <w:rPr/>
+      </w:pPr>
+      <w:r>
+        <w:rPr/>
+        <w:t xml:space="preserve">Чтобы писать запросы, надо зайти в  Query Tool. Таблица =&gt; ПКМ =&gt; Query Tool. </w:t>
+      </w:r>
+    </w:p>
+    <w:p>
+      <w:pPr>
+        <w:pStyle w:val="Normal"/>
+        <w:jc w:val="left"/>
+        <w:rPr/>
+      </w:pPr>
+      <w:r>
+        <w:rPr/>
+      </w:r>
+    </w:p>
+    <w:p>
+      <w:pPr>
+        <w:pStyle w:val="Normal"/>
+        <w:jc w:val="left"/>
+        <w:rPr/>
+      </w:pPr>
+      <w:r>
+        <w:rPr/>
+        <w:drawing>
+          <wp:anchor behindDoc="0" distT="0" distB="0" distL="0" distR="0" simplePos="0" locked="0" layoutInCell="0" allowOverlap="1" relativeHeight="10">
+            <wp:simplePos x="0" y="0"/>
+            <wp:positionH relativeFrom="column">
+              <wp:align>center</wp:align>
+            </wp:positionH>
+            <wp:positionV relativeFrom="paragraph">
+              <wp:posOffset>635</wp:posOffset>
+            </wp:positionV>
+            <wp:extent cx="5940425" cy="4577715"/>
+            <wp:effectExtent l="0" t="0" r="0" b="0"/>
+            <wp:wrapSquare wrapText="largest"/>
+            <wp:docPr id="9" name="Image9" descr=""/>
+            <wp:cNvGraphicFramePr>
+              <a:graphicFrameLocks xmlns:a="http://schemas.openxmlformats.org/drawingml/2006/main" noChangeAspect="1"/>
+            </wp:cNvGraphicFramePr>
+            <a:graphic xmlns:a="http://schemas.openxmlformats.org/drawingml/2006/main">
+              <a:graphicData uri="http://schemas.openxmlformats.org/drawingml/2006/picture">
+                <pic:pic xmlns:pic="http://schemas.openxmlformats.org/drawingml/2006/picture">
+                  <pic:nvPicPr>
+                    <pic:cNvPr id="9" name="Image9" descr=""/>
+                    <pic:cNvPicPr>
+                      <a:picLocks noChangeAspect="1" noChangeArrowheads="1"/>
+                    </pic:cNvPicPr>
+                  </pic:nvPicPr>
+                  <pic:blipFill>
+                    <a:blip r:embed="rId10"/>
+                    <a:stretch>
+                      <a:fillRect/>
+                    </a:stretch>
+                  </pic:blipFill>
+                  <pic:spPr bwMode="auto">
+                    <a:xfrm>
+                      <a:off x="0" y="0"/>
+                      <a:ext cx="5940425" cy="4577715"/>
+                    </a:xfrm>
+                    <a:prstGeom prst="rect">
+                      <a:avLst/>
+                    </a:prstGeom>
+                    <a:noFill/>
+                  </pic:spPr>
+                </pic:pic>
+              </a:graphicData>
+            </a:graphic>
+          </wp:anchor>
+        </w:drawing>
+      </w:r>
+    </w:p>
+    <w:p>
+      <w:pPr>
+        <w:pStyle w:val="Normal"/>
+        <w:jc w:val="left"/>
+        <w:rPr/>
+      </w:pPr>
+      <w:r>
+        <w:rPr/>
+        <w:t xml:space="preserve">Запрос </w:t>
+      </w:r>
+      <w:r>
+        <w:rPr/>
+        <w:t>1 с выводом данных</w:t>
+      </w:r>
+    </w:p>
+    <w:p>
+      <w:pPr>
+        <w:pStyle w:val="Normal"/>
+        <w:jc w:val="left"/>
+        <w:rPr/>
+      </w:pPr>
+      <w:r>
+        <w:rPr/>
+      </w:r>
+    </w:p>
+    <w:p>
+      <w:pPr>
+        <w:pStyle w:val="Normal"/>
+        <w:jc w:val="left"/>
+        <w:rPr/>
+      </w:pPr>
+      <w:r>
+        <w:drawing>
+          <wp:anchor behindDoc="0" distT="0" distB="0" distL="0" distR="0" simplePos="0" locked="0" layoutInCell="0" allowOverlap="1" relativeHeight="11">
+            <wp:simplePos x="0" y="0"/>
+            <wp:positionH relativeFrom="column">
+              <wp:align>center</wp:align>
+            </wp:positionH>
+            <wp:positionV relativeFrom="paragraph">
+              <wp:posOffset>635</wp:posOffset>
+            </wp:positionV>
+            <wp:extent cx="5391150" cy="5915025"/>
+            <wp:effectExtent l="0" t="0" r="0" b="0"/>
+            <wp:wrapSquare wrapText="largest"/>
+            <wp:docPr id="10" name="Image10" descr=""/>
+            <wp:cNvGraphicFramePr>
+              <a:graphicFrameLocks xmlns:a="http://schemas.openxmlformats.org/drawingml/2006/main" noChangeAspect="1"/>
+            </wp:cNvGraphicFramePr>
+            <a:graphic xmlns:a="http://schemas.openxmlformats.org/drawingml/2006/main">
+              <a:graphicData uri="http://schemas.openxmlformats.org/drawingml/2006/picture">
+                <pic:pic xmlns:pic="http://schemas.openxmlformats.org/drawingml/2006/picture">
+                  <pic:nvPicPr>
+                    <pic:cNvPr id="10" name="Image10" descr=""/>
+                    <pic:cNvPicPr>
+                      <a:picLocks noChangeAspect="1" noChangeArrowheads="1"/>
+                    </pic:cNvPicPr>
+                  </pic:nvPicPr>
+                  <pic:blipFill>
+                    <a:blip r:embed="rId11"/>
+                    <a:stretch>
+                      <a:fillRect/>
+                    </a:stretch>
+                  </pic:blipFill>
+                  <pic:spPr bwMode="auto">
+                    <a:xfrm>
+                      <a:off x="0" y="0"/>
+                      <a:ext cx="5391150" cy="5915025"/>
+                    </a:xfrm>
+                    <a:prstGeom prst="rect">
+                      <a:avLst/>
+                    </a:prstGeom>
+                    <a:noFill/>
+                  </pic:spPr>
+                </pic:pic>
+              </a:graphicData>
+            </a:graphic>
+          </wp:anchor>
+        </w:drawing>
+      </w:r>
+      <w:r>
+        <w:rPr/>
+        <w:t xml:space="preserve">Запрос </w:t>
+      </w:r>
+      <w:r>
+        <w:rPr/>
+        <w:t>2 с выводом данных</w:t>
+      </w:r>
+    </w:p>
+    <w:p>
+      <w:pPr>
+        <w:pStyle w:val="Normal"/>
+        <w:jc w:val="left"/>
+        <w:rPr/>
+      </w:pPr>
+      <w:r>
+        <w:rPr/>
+        <w:drawing>
+          <wp:anchor behindDoc="0" distT="0" distB="0" distL="0" distR="0" simplePos="0" locked="0" layoutInCell="0" allowOverlap="1" relativeHeight="12">
+            <wp:simplePos x="0" y="0"/>
+            <wp:positionH relativeFrom="column">
+              <wp:align>center</wp:align>
+            </wp:positionH>
+            <wp:positionV relativeFrom="paragraph">
+              <wp:posOffset>635</wp:posOffset>
+            </wp:positionV>
+            <wp:extent cx="5940425" cy="2672715"/>
+            <wp:effectExtent l="0" t="0" r="0" b="0"/>
+            <wp:wrapSquare wrapText="largest"/>
+            <wp:docPr id="11" name="Image11" descr=""/>
+            <wp:cNvGraphicFramePr>
+              <a:graphicFrameLocks xmlns:a="http://schemas.openxmlformats.org/drawingml/2006/main" noChangeAspect="1"/>
+            </wp:cNvGraphicFramePr>
+            <a:graphic xmlns:a="http://schemas.openxmlformats.org/drawingml/2006/main">
+              <a:graphicData uri="http://schemas.openxmlformats.org/drawingml/2006/picture">
+                <pic:pic xmlns:pic="http://schemas.openxmlformats.org/drawingml/2006/picture">
+                  <pic:nvPicPr>
+                    <pic:cNvPr id="11" name="Image11" descr=""/>
+                    <pic:cNvPicPr>
+                      <a:picLocks noChangeAspect="1" noChangeArrowheads="1"/>
+                    </pic:cNvPicPr>
+                  </pic:nvPicPr>
+                  <pic:blipFill>
+                    <a:blip r:embed="rId12"/>
+                    <a:stretch>
+                      <a:fillRect/>
+                    </a:stretch>
+                  </pic:blipFill>
+                  <pic:spPr bwMode="auto">
+                    <a:xfrm>
+                      <a:off x="0" y="0"/>
+                      <a:ext cx="5940425" cy="2672715"/>
+                    </a:xfrm>
+                    <a:prstGeom prst="rect">
+                      <a:avLst/>
+                    </a:prstGeom>
+                    <a:noFill/>
+                  </pic:spPr>
+                </pic:pic>
+              </a:graphicData>
+            </a:graphic>
+          </wp:anchor>
+        </w:drawing>
       </w:r>
     </w:p>
     <w:p>
@@ -1673,7 +1908,23 @@
       </w:pPr>
       <w:r>
         <w:rPr/>
-        <w:t>/*Какие навыки получили во время выполнения лабораторной работы*/</w:t>
+        <w:t xml:space="preserve">Получили навыки </w:t>
+      </w:r>
+      <w:r>
+        <w:rPr>
+          <w:lang w:val="ru-RU"/>
+        </w:rPr>
+        <w:t xml:space="preserve">реализовывать запросы на языке </w:t>
+      </w:r>
+      <w:r>
+        <w:rPr/>
+        <w:t>SQL</w:t>
+      </w:r>
+      <w:r>
+        <w:rPr>
+          <w:lang w:val="ru-RU"/>
+        </w:rPr>
+        <w:t xml:space="preserve"> и анализировать результаты запросов</w:t>
       </w:r>
     </w:p>
     <w:p>

</xml_diff>